<commit_message>
fix: evidencia real con Groq, memoria semantica y prompt del parte
</commit_message>
<xml_diff>
--- a/docs/informe-ep2.docx
+++ b/docs/informe-ep2.docx
@@ -75,7 +75,7 @@
           <w:sz w:val="19"/>
           <w:szCs w:val="19"/>
         </w:rPr>
-        <w:t xml:space="preserve">[Nombre 1] y [Nombre 2] · Sección [Sección] · Docente: [Docente]</w:t>
+        <w:t xml:space="preserve">Benjamín Ibáñez · Sección: 001D · Docente: Giocrisrai Godoy Bonillo</w:t>
       </w:r>
     </w:p>
     <w:p>
@@ -154,7 +154,7 @@
           <w:sz w:val="21"/>
           <w:szCs w:val="21"/>
         </w:rPr>
-        <w:t xml:space="preserve">Este informe presenta un agente que convierte el reporte de una persona desaparecida en un plan de búsqueda por fases y lo replanifica cuando el clima invalida la ventana de un medio. La decisión se calcula con código determinista y seis tools de dominio; un grafo LangGraph de cinco nodos orquesta contexto, cálculo, publicación, redacción y memoria. El modelo de lenguaje solo redacta el parte. El agente conserva memoria de sesión, recupera protocolo y criterios por búsqueda semántica y publica planes validados. Se verificó con 11 pruebas y dos actos end-to-end: el plan v1 asigna helicóptero y dron dentro de su ventana; el plan v2 los descarta por viento y refuerza el barrido terrestre.</w:t>
+        <w:t xml:space="preserve">Este informe presenta un agente que convierte el reporte de una persona desaparecida en un plan de búsqueda por fases y lo replanifica cuando el clima invalida la ventana de un medio. La decisión se calcula con código determinista y seis tools de dominio; un grafo LangGraph de cinco nodos orquesta contexto, cálculo, publicación, redacción y memoria. El modelo de lenguaje solo redacta el parte. El agente conserva memoria de sesión, recupera protocolo y criterios por búsqueda semántica y publica planes validados. Se verificó con 14 pruebas y dos actos end-to-end ejecutados con Groq real: el plan v1 asigna helicóptero y dron dentro de su ventana; el plan v2 descarta HEL-1 en ambas zonas y DR-1 en Z-2, conserva DR-1 en Z-5 y refuerza el barrido terrestre.</w:t>
       </w:r>
     </w:p>
     <w:p>
@@ -192,7 +192,7 @@
           <w:sz w:val="21"/>
           <w:szCs w:val="21"/>
         </w:rPr>
-        <w:t xml:space="preserve">La coordinación de un operativo de búsqueda y rescate (SAR) exige priorizar zonas, asignar medios y justificar cada decisión ante un protocolo. En un caso real, el pronóstico cambia y obliga a replanificar. El objetivo de este trabajo es construir un agente que reciba el reporte, consulte los datos del caso y produzca un plan trazable, con memoria entre turnos y capacidad de adaptarse a un evento de viento.</w:t>
+        <w:t xml:space="preserve">La coordinación de un operativo de búsqueda y rescate (SAR) exige priorizar zonas, asignar medios y justificar cada decisión ante un protocolo. En un caso real, el pronóstico cambia y obliga a replanificar. El objetivo de este trabajo es construir un agente que reciba el reporte, consulte los datos del caso y produzca un plan trazable, con memoria entre turnos y capacidad de adaptarse a un evento de viento (ISY0101, 2026).</w:t>
       </w:r>
     </w:p>
     <w:p>
@@ -249,7 +249,7 @@
           <w:sz w:val="21"/>
           <w:szCs w:val="21"/>
         </w:rPr>
-        <w:t xml:space="preserve">El flujo se implementa en agent/grafo.py con LangGraph (LangChain, 2026). El estado EstadoPlan es un TypedDict que viaja por cinco nodos: contexto, calcular, publicar, redactar y memorizar (Figura 1). contexto recupera el plan previo de la sesión, arma los hechos de tools ([T#]) y busca fragmentos del corpus ([F#]). calcular aplica la fórmula de prioridad y construye las fases. publicar llama a publicar_plan, que valida y escribe data/planes/plan-vN.json. redactar pide al LLM el parte narrativo con el plan ya publicado. memorizar registra el turno en el buffer y en Chroma.</w:t>
+        <w:t xml:space="preserve">El flujo se implementa en agent/grafo.py con LangGraph (LangChain, 2026). El estado EstadoPlan es un TypedDict que viaja por cinco nodos: contexto, calcular, publicar, redactar y memorizar (Figura 1). contexto recupera el plan previo del buffer y los recuerdos semánticos de Chroma, arma los hechos de tools ([T#]) y busca fragmentos del corpus ([F#]). calcular aplica la fórmula de prioridad y construye las fases. publicar llama a publicar_plan, que valida y escribe data/planes/plan-vN.json. redactar pide al LLM el parte narrativo con el plan ya publicado. memorizar registra el turno en el buffer y en Chroma.</w:t>
       </w:r>
     </w:p>
     <w:p>
@@ -287,7 +287,7 @@
           <w:sz w:val="21"/>
           <w:szCs w:val="21"/>
         </w:rPr>
-        <w:t xml:space="preserve">El LLM no decide: recibe el plan validado y redacta. En producción se usa ClienteLangChain con Groq openai/gpt-oss-120b (Groq, 2026); en pruebas y evidencia se usa ClienteFalso, determinista y sin cuota. LangSmith es opcional y se activa solo si hay LANGSMITH_API_KEY.</w:t>
+        <w:t xml:space="preserve">El LLM no decide: recibe el plan validado y redacta. En producción se usa ClienteLangChain con Groq openai/gpt-oss-120b (Groq, 2026); en pruebas se usa ClienteFalso, determinista y sin cuota. Los actos 1 y 2 de docs/ se ejecutaron con Groq real. LangSmith es opcional y se activa solo si hay LANGSMITH_API_KEY.</w:t>
       </w:r>
     </w:p>
     <w:p>
@@ -1180,7 +1180,7 @@
           <w:sz w:val="21"/>
           <w:szCs w:val="21"/>
         </w:rPr>
-        <w:t xml:space="preserve">La autonomía es acotada pero real: el agente decide qué consultar, en qué orden y cómo componer el plan; no hay una plantilla fija de respuesta. La secuencia queda en logs/trace.jsonl (planificación, plan publicado, parte, memoria). El guardrail central es que el plan se calcula en Python y el LLM no puede introducir zonas o medios: aunque alucine, el texto no se convierte en plan; solo se escribe lo que pasó por publicar_plan.</w:t>
+        <w:t xml:space="preserve">El flujo es un pipeline determinista: el nodo contexto ejecuta siempre la recuperación y las verificaciones de dominio, y la plantilla de fases es fija. La autonomía está en el cálculo de prioridades y en la selección de medios viables, no en una elección libre de tools por el LLM. La secuencia queda en logs/trace.jsonl (planificación, memoria semántica, plan publicado, parte, memoria). El guardrail central es que el plan se calcula en Python y el LLM no puede introducir zonas o medios: aunque alucine, el texto no se convierte en plan; solo se escribe lo que pasó por publicar_plan (Russell &amp; Norvig, 2021).</w:t>
       </w:r>
     </w:p>
     <w:p>
@@ -1237,7 +1237,7 @@
           <w:sz w:val="21"/>
           <w:szCs w:val="21"/>
         </w:rPr>
-        <w:t xml:space="preserve">El RAG usa una colección conocimiento con el protocolo y los criterios de prioridad. Cada decisión cita fragmentos [F#] y hechos de tools [T#]. En el acto 2, cito_plan_previo=True y las fuentes incluyen memoria:caso-morado: el parte recupera el plan v1 y explica qué cambió. La recuperación semántica no se limita a repetir el buffer: Chroma permite buscar por significado y filtrar por sesión, lo que sostiene la continuidad entre turnos y la justificación histórica.</w:t>
+        <w:t xml:space="preserve">El RAG usa una colección conocimiento con el protocolo y los criterios de prioridad; el parte narrativo cita fragmentos [F#] y hechos de tools [T#], mientras el JSON del plan guarda citas legibles. En el acto 2, cito_plan_previo=True y las fuentes incluyen memoria-semantica:caso-morado y memoria:caso-morado; el parte recibe el plan v1, y el motivo del cambio se escribe en el plan v2. La recuperación semántica no se limita a repetir el buffer: Chroma permite buscar por significado y filtrar por sesión, lo que sostiene la continuidad entre turnos y la justificación histórica (Lewis et al., 2020).</w:t>
       </w:r>
     </w:p>
     <w:p>
@@ -1294,7 +1294,7 @@
           <w:sz w:val="21"/>
           <w:szCs w:val="21"/>
         </w:rPr>
-        <w:t xml:space="preserve">El acto 1 publica el plan v1 con HEL-1 y DR-1 en Z-2 y Z-5 entre 06:00 y 12:00. El acto 2 reemplaza esas franjas por viento de 41 km/h en Z-2 y 38 km/h en Z-5. viabilidad_medio descarta HEL-1 en ambas por la regla de 35 km/h y DR-1 en Z-2 por superar 40 km/h; DR-1 se mantiene en Z-5. El plan v2 refuerza Z-2 con EQ-1, conserva DR-1 en Z-5, mantiene EQ-1 en Z-1 y la fase nocturna. El motivo se escribe con la regla citada y se propone reevaluar HEL-1 en 12:00–18:00, cuando el pronóstico baja a 24, 22 y 26 km/h (Figura 2).</w:t>
+        <w:t xml:space="preserve">El acto 1 publica el plan v1 con HEL-1 y DR-1 en Z-2 y Z-5 entre 06:00 y 12:00. El acto 2 reemplaza esas franjas por viento de 41 km/h en Z-2 y 38 km/h en Z-5. viabilidad_medio descarta HEL-1 en ambas por la regla de 35 km/h y DR-1 en Z-2 por superar 40 km/h; DR-1 se mantiene en Z-5. El plan v2 refuerza Z-2 con EQ-1, conserva DR-1 en Z-5, mantiene EQ-1 en Z-1 y la fase nocturna. El motivo se escribe con la regla citada y se propone reevaluar HEL-1 en 12:00–18:00, cuando el pronóstico baja a 24, 22 y 26 km/h (Figura 2). La reevaluación sigue el ciclo de razonar, actuar y volver a observar el entorno de ReAct (Yao et al., 2023).</w:t>
       </w:r>
     </w:p>
     <w:tbl>
@@ -2072,7 +2072,7 @@
           <w:sz w:val="21"/>
           <w:szCs w:val="21"/>
         </w:rPr>
-        <w:t xml:space="preserve">La suite tiene 11 pruebas: 6 del motor (chunking, cliente falso, memoria, agente, puerta de dominio, tool de escritura) y 5 del dominio (plan v1, evento de viento, seguridad nocturna, grafo completo, validación de publicar_plan). Todas pasan con uv run python -m pytest -q (11/11). La ingesta indexa 7 documentos y las dos consultas de verificación devuelven MATCH (2/2): reglas de viento y fórmula de prioridad.</w:t>
+        <w:t xml:space="preserve">La suite tiene 14 pruebas: 8 del motor (chunking, cliente falso, memoria, agente, puerta de dominio, tool de escritura, cliente LangChain y citas con espacios) y 6 del dominio (plan v1, evento de viento, seguridad nocturna, grafo completo, validación de publicar_plan y recuperación semántica en contexto). Todas pasan con uv run python -m pytest -q (14/14). La ingesta carga 2 documentos y genera 7 fragmentos; las dos consultas de verificación devuelven MATCH (2/2): reglas de viento y fórmula de prioridad.</w:t>
       </w:r>
     </w:p>
     <w:p>
@@ -2091,7 +2091,7 @@
           <w:sz w:val="21"/>
           <w:szCs w:val="21"/>
         </w:rPr>
-        <w:t xml:space="preserve">Los actos se ejecutaron end-to-end con --falso y quedaron en docs/salida-acto1.txt y docs/salida-acto2.txt, con rutas del repo entregable y la traza de cuatro pasos. No se usó Groq real en esta entrega para no consumir cuota y porque la evidencia determinista es reproducible; el camino real (ClienteLangChain + gpt-oss-120b) está implementado y se activa con .env. La Tabla 3 mapea cada indicador de la pauta con su evidencia.</w:t>
+        <w:t xml:space="preserve">Los actos se ejecutaron end-to-end con Groq real (ClienteLangChain + gpt-oss-120b) y quedaron en docs/salida-acto1.txt y docs/salida-acto2.txt, con rutas relativas y la traza de cinco pasos. El plan v2 se conserva en docs/plan-v2-evidencia.json. La Tabla 3 mapea cada indicador de la pauta con su evidencia.</w:t>
       </w:r>
     </w:p>
     <w:tbl>
@@ -2269,7 +2269,7 @@
                 <w:sz w:val="18"/>
                 <w:szCs w:val="18"/>
               </w:rPr>
-              <w:t xml:space="preserve">Seis tools de consulta/cálculo/escritura y loop autónomo consulta→herramienta→respuesta</w:t>
+              <w:t xml:space="preserve">Seis tools de consulta/cálculo/escritura y pipeline consulta→contexto→plan→parte; el LLM solo redacta</w:t>
             </w:r>
           </w:p>
         </w:tc>
@@ -2559,7 +2559,7 @@
                 <w:sz w:val="18"/>
                 <w:szCs w:val="18"/>
               </w:rPr>
-              <w:t xml:space="preserve">Chroma con embeddings locales; filtro por sesión y recuperación semántica del corpus</w:t>
+              <w:t xml:space="preserve">Buffer + Chroma; `recuperar` por sesión en el nodo contexto y recuperación semántica del corpus</w:t>
             </w:r>
           </w:p>
         </w:tc>
@@ -3138,7 +3138,7 @@
                 <w:sz w:val="18"/>
                 <w:szCs w:val="18"/>
               </w:rPr>
-              <w:t xml:space="preserve">Lenguaje técnico, trazas, pruebas y evidencia reproducible en el repositorio</w:t>
+              <w:t xml:space="preserve">Lenguaje técnico, transcripciones, pruebas y evidencia reproducible en el repositorio</w:t>
             </w:r>
           </w:p>
         </w:tc>
@@ -3169,7 +3169,7 @@
                 <w:sz w:val="18"/>
                 <w:szCs w:val="18"/>
               </w:rPr>
-              <w:t xml:space="preserve">docs/; tests/; logs/trace.jsonl</w:t>
+              <w:t xml:space="preserve">docs/salida-acto*.txt; tests/</w:t>
             </w:r>
           </w:p>
         </w:tc>
@@ -3229,7 +3229,7 @@
           <w:sz w:val="21"/>
           <w:szCs w:val="21"/>
         </w:rPr>
-        <w:t xml:space="preserve">El caso es simulado y único; el corpus es pequeño y el parte narrativo no se evaluó con métricas de calidad. La memoria y el RAG dependen de Chroma y de la descarga local de embeddings. El agente no reemplaza al coordinador: propone un plan validado y explicable. Como trabajo futuro se propone ejecutar la evidencia con Groq real, ampliar el corpus y medir la calidad del parte con una rúbrica.</w:t>
+        <w:t xml:space="preserve">El caso es simulado y único; el corpus es pequeño y el parte narrativo no se evaluó con métricas de calidad. La memoria y el RAG dependen de Chroma y de la descarga local de embeddings. El agente no reemplaza al coordinador: propone un plan validado y explicable. Como trabajo futuro se propone ampliar el corpus, medir la calidad del parte con una rúbrica y validar el plan con datos operativos reales.</w:t>
       </w:r>
     </w:p>
     <w:p>

</xml_diff>